<commit_message>
Upload do Banco de Dados relacional e Alterção na Documentação do TCC (adicionando a explicação do sistema SaaS)
</commit_message>
<xml_diff>
--- a/Documentação/Primeira Edição/TCC - Documentação.docx
+++ b/Documentação/Primeira Edição/TCC - Documentação.docx
@@ -1593,7 +1593,7 @@
           <w:bCs/>
           <w:szCs w:val="24"/>
         </w:rPr>
-        <w:t>7</w:t>
+        <w:t>8</w:t>
       </w:r>
     </w:p>
     <w:p>
@@ -3448,6 +3448,259 @@
         </w:rPr>
         <w:t>Dessa forma, o projeto pode ser desenvolvido integralmente sem nenhum investimento financeiro, tornando-o viável dentro das condições de um trabalho de conclusão de curso.</w:t>
       </w:r>
+    </w:p>
+    <w:p>
+      <w:pPr>
+        <w:spacing w:line="360" w:lineRule="auto"/>
+        <w:ind w:firstLine="720"/>
+        <w:jc w:val="both"/>
+        <w:rPr>
+          <w:szCs w:val="24"/>
+        </w:rPr>
+      </w:pPr>
+      <w:r>
+        <w:rPr>
+          <w:szCs w:val="24"/>
+        </w:rPr>
+        <w:t xml:space="preserve">O sistema adota um modelo de monetização baseado em assinatura mensal, conhecido como SaaS (Software as a Service), oferecendo três planos com diferentes </w:t>
+      </w:r>
+      <w:r>
+        <w:rPr>
+          <w:szCs w:val="24"/>
+        </w:rPr>
+        <w:lastRenderedPageBreak/>
+        <w:t>níveis de acesso e capacidade. O Plano 1, no valor de R$89,90 por mês, é voltado para pequenas empresas e permite o cadastro de até 50 funcionários e 1 administrador. O Plano 2, no valor de R$169,90 por mês, amplia os limites para até 200 funcionários e 3 administradores, incluindo funcionalidades avançadas como geração de relatórios em PDF e dashboard completo. O Plano 3, no valor de R$210,90 por mês, oferece acesso ilimitado a todas as funcionalidades do sistema, sem restrição de funcionários ou administradores. Essa estrutura de planos garante a sustentabilidade financeira do projeto após sua implantação, sem comprometer a acessibilidade para empresas de menor porte.</w:t>
+      </w:r>
+    </w:p>
+    <w:p>
+      <w:pPr>
+        <w:spacing w:line="360" w:lineRule="auto"/>
+        <w:ind w:firstLine="720"/>
+        <w:jc w:val="both"/>
+        <w:rPr>
+          <w:szCs w:val="24"/>
+        </w:rPr>
+      </w:pPr>
+    </w:p>
+    <w:p>
+      <w:pPr>
+        <w:spacing w:line="360" w:lineRule="auto"/>
+        <w:ind w:firstLine="720"/>
+        <w:jc w:val="both"/>
+        <w:rPr>
+          <w:szCs w:val="24"/>
+        </w:rPr>
+      </w:pPr>
+    </w:p>
+    <w:p>
+      <w:pPr>
+        <w:spacing w:line="360" w:lineRule="auto"/>
+        <w:ind w:firstLine="720"/>
+        <w:jc w:val="both"/>
+        <w:rPr>
+          <w:szCs w:val="24"/>
+        </w:rPr>
+      </w:pPr>
+    </w:p>
+    <w:p>
+      <w:pPr>
+        <w:spacing w:line="360" w:lineRule="auto"/>
+        <w:ind w:firstLine="720"/>
+        <w:jc w:val="both"/>
+        <w:rPr>
+          <w:szCs w:val="24"/>
+        </w:rPr>
+      </w:pPr>
+    </w:p>
+    <w:p>
+      <w:pPr>
+        <w:spacing w:line="360" w:lineRule="auto"/>
+        <w:ind w:firstLine="720"/>
+        <w:jc w:val="both"/>
+        <w:rPr>
+          <w:szCs w:val="24"/>
+        </w:rPr>
+      </w:pPr>
+    </w:p>
+    <w:p>
+      <w:pPr>
+        <w:spacing w:line="360" w:lineRule="auto"/>
+        <w:ind w:firstLine="720"/>
+        <w:jc w:val="both"/>
+        <w:rPr>
+          <w:szCs w:val="24"/>
+        </w:rPr>
+      </w:pPr>
+    </w:p>
+    <w:p>
+      <w:pPr>
+        <w:spacing w:line="360" w:lineRule="auto"/>
+        <w:ind w:firstLine="720"/>
+        <w:jc w:val="both"/>
+        <w:rPr>
+          <w:szCs w:val="24"/>
+        </w:rPr>
+      </w:pPr>
+    </w:p>
+    <w:p>
+      <w:pPr>
+        <w:spacing w:line="360" w:lineRule="auto"/>
+        <w:ind w:firstLine="720"/>
+        <w:jc w:val="both"/>
+        <w:rPr>
+          <w:szCs w:val="24"/>
+        </w:rPr>
+      </w:pPr>
+    </w:p>
+    <w:p>
+      <w:pPr>
+        <w:spacing w:line="360" w:lineRule="auto"/>
+        <w:ind w:firstLine="720"/>
+        <w:jc w:val="both"/>
+        <w:rPr>
+          <w:szCs w:val="24"/>
+        </w:rPr>
+      </w:pPr>
+    </w:p>
+    <w:p>
+      <w:pPr>
+        <w:spacing w:line="360" w:lineRule="auto"/>
+        <w:ind w:firstLine="720"/>
+        <w:jc w:val="both"/>
+        <w:rPr>
+          <w:szCs w:val="24"/>
+        </w:rPr>
+      </w:pPr>
+    </w:p>
+    <w:p>
+      <w:pPr>
+        <w:spacing w:line="360" w:lineRule="auto"/>
+        <w:ind w:firstLine="720"/>
+        <w:jc w:val="both"/>
+        <w:rPr>
+          <w:szCs w:val="24"/>
+        </w:rPr>
+      </w:pPr>
+    </w:p>
+    <w:p>
+      <w:pPr>
+        <w:spacing w:line="360" w:lineRule="auto"/>
+        <w:ind w:firstLine="720"/>
+        <w:jc w:val="both"/>
+        <w:rPr>
+          <w:szCs w:val="24"/>
+        </w:rPr>
+      </w:pPr>
+    </w:p>
+    <w:p>
+      <w:pPr>
+        <w:spacing w:line="360" w:lineRule="auto"/>
+        <w:ind w:firstLine="720"/>
+        <w:jc w:val="both"/>
+        <w:rPr>
+          <w:szCs w:val="24"/>
+        </w:rPr>
+      </w:pPr>
+    </w:p>
+    <w:p>
+      <w:pPr>
+        <w:spacing w:line="360" w:lineRule="auto"/>
+        <w:ind w:firstLine="720"/>
+        <w:jc w:val="both"/>
+        <w:rPr>
+          <w:szCs w:val="24"/>
+        </w:rPr>
+      </w:pPr>
+    </w:p>
+    <w:p>
+      <w:pPr>
+        <w:spacing w:line="360" w:lineRule="auto"/>
+        <w:ind w:firstLine="720"/>
+        <w:jc w:val="both"/>
+        <w:rPr>
+          <w:szCs w:val="24"/>
+        </w:rPr>
+      </w:pPr>
+    </w:p>
+    <w:p>
+      <w:pPr>
+        <w:spacing w:line="360" w:lineRule="auto"/>
+        <w:ind w:firstLine="720"/>
+        <w:jc w:val="both"/>
+        <w:rPr>
+          <w:szCs w:val="24"/>
+        </w:rPr>
+      </w:pPr>
+    </w:p>
+    <w:p>
+      <w:pPr>
+        <w:spacing w:line="360" w:lineRule="auto"/>
+        <w:ind w:firstLine="720"/>
+        <w:jc w:val="both"/>
+        <w:rPr>
+          <w:szCs w:val="24"/>
+        </w:rPr>
+      </w:pPr>
+    </w:p>
+    <w:p>
+      <w:pPr>
+        <w:spacing w:line="360" w:lineRule="auto"/>
+        <w:ind w:firstLine="720"/>
+        <w:jc w:val="both"/>
+        <w:rPr>
+          <w:szCs w:val="24"/>
+        </w:rPr>
+      </w:pPr>
+    </w:p>
+    <w:p>
+      <w:pPr>
+        <w:spacing w:line="360" w:lineRule="auto"/>
+        <w:ind w:firstLine="720"/>
+        <w:jc w:val="both"/>
+        <w:rPr>
+          <w:szCs w:val="24"/>
+        </w:rPr>
+      </w:pPr>
+    </w:p>
+    <w:p>
+      <w:pPr>
+        <w:spacing w:line="360" w:lineRule="auto"/>
+        <w:ind w:firstLine="720"/>
+        <w:jc w:val="both"/>
+        <w:rPr>
+          <w:szCs w:val="24"/>
+        </w:rPr>
+      </w:pPr>
+    </w:p>
+    <w:p>
+      <w:pPr>
+        <w:spacing w:line="360" w:lineRule="auto"/>
+        <w:ind w:firstLine="720"/>
+        <w:jc w:val="both"/>
+        <w:rPr>
+          <w:szCs w:val="24"/>
+        </w:rPr>
+      </w:pPr>
+    </w:p>
+    <w:p>
+      <w:pPr>
+        <w:spacing w:line="360" w:lineRule="auto"/>
+        <w:ind w:firstLine="720"/>
+        <w:jc w:val="both"/>
+        <w:rPr>
+          <w:szCs w:val="24"/>
+        </w:rPr>
+      </w:pPr>
+    </w:p>
+    <w:p>
+      <w:pPr>
+        <w:spacing w:line="360" w:lineRule="auto"/>
+        <w:ind w:firstLine="720"/>
+        <w:jc w:val="both"/>
+        <w:rPr>
+          <w:szCs w:val="24"/>
+        </w:rPr>
+      </w:pPr>
     </w:p>
     <w:p>
       <w:pPr>
@@ -9358,7 +9611,6 @@
         <w:docPartUnique/>
       </w:docPartObj>
     </w:sdtPr>
-    <w:sdtEndPr/>
     <w:sdtContent>
       <w:p>
         <w:pPr>

</xml_diff>